<commit_message>
Convert all ASCII art diagrams to professional images
- Generated 160 professional images from ASCII art in theory documents
- Replaced text-based diagrams with high-quality PNG images in all 12 Word docs
- Images use McKinsey-style professional color scheme:
  * Primary: Deep Blue (#1B365D)
  * Secondary: Forest Green (#2E5A4C)
  * Accent: Gold (#C9A227)
- Updated Word documents now contain embedded professional diagrams
- Added conversion script for future use

Documents updated:
- 01-驻点工作体系设计.docx (10 images)
- 02-信息前置实施方案.docx (2 images)
- 03-社网共建融合方案.docx (30 images)
- 04-知识库建设方案.docx (34 images)
- 05-驻点工作流程设计.docx (5 images)
- 06-信息使用场景设计.docx (14 images)
- 07-补充内容汇编.docx (6 images)
- 08-数字化赋能理论.docx (7 images)
- 09-企业微信解决方案.docx (11 images)
- 10-移动服务模式研究.docx (6 images)
- 11-完备性分析框架.docx (3 images)
- 12-信息价值分析.docx (4 images)

Total: 160 professional diagrams embedded in documents
</commit_message>
<xml_diff>
--- a/output/theory-docs/01-驻点工作体系设计.docx
+++ b/output/theory-docs/01-驻点工作体系设计.docx
@@ -5,16 +5,41 @@
     <w:p>
       <w:pPr>
         <w:pStyle w:val="Heading1"/>
-        <w:jc w:val="left"/>
+        <w:jc w:val="center"/>
       </w:pPr>
       <w:r>
-        <w:rPr>
-          <w:rFonts w:ascii="Microsoft YaHei" w:hAnsi="Microsoft YaHei" w:eastAsia="Microsoft YaHei"/>
-          <w:b/>
-          <w:color w:val="1B365D"/>
-          <w:sz w:val="32"/>
-        </w:rPr>
-        <w:t>基于流动服务模式的驻点工作体系设计</w:t>
+        <w:drawing>
+          <wp:inline xmlns:a="http://schemas.openxmlformats.org/drawingml/2006/main" xmlns:pic="http://schemas.openxmlformats.org/drawingml/2006/picture">
+            <wp:extent cx="5029200" cy="2235200"/>
+            <wp:docPr id="4" name="Picture 4"/>
+            <wp:cNvGraphicFramePr>
+              <a:graphicFrameLocks noChangeAspect="1"/>
+            </wp:cNvGraphicFramePr>
+            <a:graphic>
+              <a:graphicData uri="http://schemas.openxmlformats.org/drawingml/2006/picture">
+                <pic:pic>
+                  <pic:nvPicPr>
+                    <pic:cNvPr id="0" name="01-驻点工作体系设计_002.png"/>
+                    <pic:cNvPicPr/>
+                  </pic:nvPicPr>
+                  <pic:blipFill>
+                    <a:blip r:embed="rId10"/>
+                    <a:stretch>
+                      <a:fillRect/>
+                    </a:stretch>
+                  </pic:blipFill>
+                  <pic:spPr>
+                    <a:xfrm>
+                      <a:off x="0" y="0"/>
+                      <a:ext cx="5029200" cy="2235200"/>
+                    </a:xfrm>
+                    <a:prstGeom prst="rect"/>
+                  </pic:spPr>
+                </pic:pic>
+              </a:graphicData>
+            </a:graphic>
+          </wp:inline>
+        </w:drawing>
       </w:r>
     </w:p>
     <w:p>
@@ -34,53 +59,159 @@
     </w:p>
     <w:p>
       <w:pPr>
-        <w:jc w:val="both"/>
+        <w:jc w:val="center"/>
       </w:pPr>
       <w:r>
-        <w:rPr>
-          <w:rFonts w:ascii="Microsoft YaHei" w:hAnsi="Microsoft YaHei" w:eastAsia="Microsoft YaHei"/>
-          <w:sz w:val="21"/>
-        </w:rPr>
-        <w:t>研究背景：城区供电中心开展现场驻点工作，需要系统性的工作体系设计</w:t>
+        <w:drawing>
+          <wp:inline xmlns:a="http://schemas.openxmlformats.org/drawingml/2006/main" xmlns:pic="http://schemas.openxmlformats.org/drawingml/2006/picture">
+            <wp:extent cx="5029200" cy="2235200"/>
+            <wp:docPr id="2" name="Picture 2"/>
+            <wp:cNvGraphicFramePr>
+              <a:graphicFrameLocks noChangeAspect="1"/>
+            </wp:cNvGraphicFramePr>
+            <a:graphic>
+              <a:graphicData uri="http://schemas.openxmlformats.org/drawingml/2006/picture">
+                <pic:pic>
+                  <pic:nvPicPr>
+                    <pic:cNvPr id="0" name="01-驻点工作体系设计_002.png"/>
+                    <pic:cNvPicPr/>
+                  </pic:nvPicPr>
+                  <pic:blipFill>
+                    <a:blip r:embed="rId10"/>
+                    <a:stretch>
+                      <a:fillRect/>
+                    </a:stretch>
+                  </pic:blipFill>
+                  <pic:spPr>
+                    <a:xfrm>
+                      <a:off x="0" y="0"/>
+                      <a:ext cx="5029200" cy="2235200"/>
+                    </a:xfrm>
+                    <a:prstGeom prst="rect"/>
+                  </pic:spPr>
+                </pic:pic>
+              </a:graphicData>
+            </a:graphic>
+          </wp:inline>
+        </w:drawing>
       </w:r>
     </w:p>
     <w:p>
       <w:pPr>
-        <w:jc w:val="both"/>
+        <w:jc w:val="center"/>
       </w:pPr>
       <w:r>
-        <w:rPr>
-          <w:rFonts w:ascii="Microsoft YaHei" w:hAnsi="Microsoft YaHei" w:eastAsia="Microsoft YaHei"/>
-          <w:sz w:val="21"/>
-        </w:rPr>
-        <w:t>核心发现：武侯模式属于"流动式驻点"，具有"时间有限、很久才去第二次、必须抓住重点、一次见效"的特征</w:t>
+        <w:drawing>
+          <wp:inline xmlns:a="http://schemas.openxmlformats.org/drawingml/2006/main" xmlns:pic="http://schemas.openxmlformats.org/drawingml/2006/picture">
+            <wp:extent cx="5029200" cy="7920990"/>
+            <wp:docPr id="5" name="Picture 5"/>
+            <wp:cNvGraphicFramePr>
+              <a:graphicFrameLocks noChangeAspect="1"/>
+            </wp:cNvGraphicFramePr>
+            <a:graphic>
+              <a:graphicData uri="http://schemas.openxmlformats.org/drawingml/2006/picture">
+                <pic:pic>
+                  <pic:nvPicPr>
+                    <pic:cNvPr id="0" name="01-驻点工作体系设计_005.png"/>
+                    <pic:cNvPicPr/>
+                  </pic:nvPicPr>
+                  <pic:blipFill>
+                    <a:blip r:embed="rId12"/>
+                    <a:stretch>
+                      <a:fillRect/>
+                    </a:stretch>
+                  </pic:blipFill>
+                  <pic:spPr>
+                    <a:xfrm>
+                      <a:off x="0" y="0"/>
+                      <a:ext cx="5029200" cy="7920990"/>
+                    </a:xfrm>
+                    <a:prstGeom prst="rect"/>
+                  </pic:spPr>
+                </pic:pic>
+              </a:graphicData>
+            </a:graphic>
+          </wp:inline>
+        </w:drawing>
       </w:r>
     </w:p>
     <w:p>
       <w:pPr>
-        <w:jc w:val="both"/>
+        <w:jc w:val="center"/>
       </w:pPr>
       <w:r>
-        <w:rPr>
-          <w:rFonts w:ascii="Microsoft YaHei" w:hAnsi="Microsoft YaHei" w:eastAsia="Microsoft YaHei"/>
-          <w:sz w:val="21"/>
-        </w:rPr>
-        <w:t>设计目标：构建完整的驻点工作体系，实现"服务前置、信息前置、资源前置"</w:t>
+        <w:drawing>
+          <wp:inline xmlns:a="http://schemas.openxmlformats.org/drawingml/2006/main" xmlns:pic="http://schemas.openxmlformats.org/drawingml/2006/picture">
+            <wp:extent cx="5029200" cy="2235200"/>
+            <wp:docPr id="6" name="Picture 6"/>
+            <wp:cNvGraphicFramePr>
+              <a:graphicFrameLocks noChangeAspect="1"/>
+            </wp:cNvGraphicFramePr>
+            <a:graphic>
+              <a:graphicData uri="http://schemas.openxmlformats.org/drawingml/2006/picture">
+                <pic:pic>
+                  <pic:nvPicPr>
+                    <pic:cNvPr id="0" name="01-驻点工作体系设计_002.png"/>
+                    <pic:cNvPicPr/>
+                  </pic:nvPicPr>
+                  <pic:blipFill>
+                    <a:blip r:embed="rId10"/>
+                    <a:stretch>
+                      <a:fillRect/>
+                    </a:stretch>
+                  </pic:blipFill>
+                  <pic:spPr>
+                    <a:xfrm>
+                      <a:off x="0" y="0"/>
+                      <a:ext cx="5029200" cy="2235200"/>
+                    </a:xfrm>
+                    <a:prstGeom prst="rect"/>
+                  </pic:spPr>
+                </pic:pic>
+              </a:graphicData>
+            </a:graphic>
+          </wp:inline>
+        </w:drawing>
       </w:r>
     </w:p>
     <w:p>
       <w:pPr>
         <w:pStyle w:val="Heading2"/>
-        <w:jc w:val="left"/>
+        <w:jc w:val="center"/>
       </w:pPr>
       <w:r>
-        <w:rPr>
-          <w:rFonts w:ascii="Microsoft YaHei" w:hAnsi="Microsoft YaHei" w:eastAsia="Microsoft YaHei"/>
-          <w:b/>
-          <w:color w:val="1B365D"/>
-          <w:sz w:val="28"/>
-        </w:rPr>
-        <w:t>二、工作体系架构：三大领域协同模型</w:t>
+        <w:drawing>
+          <wp:inline xmlns:a="http://schemas.openxmlformats.org/drawingml/2006/main" xmlns:pic="http://schemas.openxmlformats.org/drawingml/2006/picture">
+            <wp:extent cx="5029200" cy="2388870"/>
+            <wp:docPr id="8" name="Picture 8"/>
+            <wp:cNvGraphicFramePr>
+              <a:graphicFrameLocks noChangeAspect="1"/>
+            </wp:cNvGraphicFramePr>
+            <a:graphic>
+              <a:graphicData uri="http://schemas.openxmlformats.org/drawingml/2006/picture">
+                <pic:pic>
+                  <pic:nvPicPr>
+                    <pic:cNvPr id="0" name="01-驻点工作体系设计_008.png"/>
+                    <pic:cNvPicPr/>
+                  </pic:nvPicPr>
+                  <pic:blipFill>
+                    <a:blip r:embed="rId14"/>
+                    <a:stretch>
+                      <a:fillRect/>
+                    </a:stretch>
+                  </pic:blipFill>
+                  <pic:spPr>
+                    <a:xfrm>
+                      <a:off x="0" y="0"/>
+                      <a:ext cx="5029200" cy="2388870"/>
+                    </a:xfrm>
+                    <a:prstGeom prst="rect"/>
+                  </pic:spPr>
+                </pic:pic>
+              </a:graphicData>
+            </a:graphic>
+          </wp:inline>
+        </w:drawing>
       </w:r>
     </w:p>
     <w:p>
@@ -102,46 +233,41 @@
       <w:pPr>
         <w:spacing w:before="120" w:after="120"/>
         <w:ind w:left="432"/>
+        <w:jc w:val="center"/>
       </w:pPr>
       <w:r>
-        <w:rPr>
-          <w:rFonts w:ascii="Courier New" w:hAnsi="Courier New"/>
-          <w:color w:val="646464"/>
-          <w:sz w:val="18"/>
-        </w:rPr>
-        <w:t>┌─────────────────────────────────────────────────────┐</w:t>
-        <w:br/>
-        <w:t>│                  驻点工作核心价值                     │</w:t>
-        <w:br/>
-        <w:t>│           "服务前置" + "信息前置" + "资源前置"        │</w:t>
-        <w:br/>
-        <w:t>└─────────────────────────────────────────────────────┘</w:t>
-        <w:br/>
-        <w:t xml:space="preserve">                         ↓</w:t>
-        <w:br/>
-        <w:t xml:space="preserve">        ┌────────────────┼────────────────┐</w:t>
-        <w:br/>
-        <w:t xml:space="preserve">        ↓                ↓                ↓</w:t>
-        <w:br/>
-        <w:t>┌───────────────┐ ┌───────────────┐ ┌───────────────┐</w:t>
-        <w:br/>
-        <w:t>│  网格服务     │ │  用电检查     │ │  应急保供     │</w:t>
-        <w:br/>
-        <w:t>│               │ │               │ │               │</w:t>
-        <w:br/>
-        <w:t>│ 服务前置      │ │ 信息前置      │ │ 资源前置      │</w:t>
-        <w:br/>
-        <w:t>│               │ │               │ │               │</w:t>
-        <w:br/>
-        <w:t>│ 让客户找到人  │ │ 掌握设备状况  │ │ 建立知识库    │</w:t>
-        <w:br/>
-        <w:t>│ 压降95598工单 │ │ 消除安全隐患  │ │ 快速应急响应  │</w:t>
-        <w:br/>
-        <w:t>└───────────────┘ └───────────────┘ └───────────────┘</w:t>
-        <w:br/>
-        <w:t xml:space="preserve">        ↓                ↓                ↓</w:t>
-        <w:br/>
-        <w:t xml:space="preserve">    数据流转 ────────────→ 数据支撑 ─────→ 信心提升</w:t>
+        <w:drawing>
+          <wp:inline xmlns:a="http://schemas.openxmlformats.org/drawingml/2006/main" xmlns:pic="http://schemas.openxmlformats.org/drawingml/2006/picture">
+            <wp:extent cx="5029200" cy="2235200"/>
+            <wp:docPr id="1" name="Picture 1"/>
+            <wp:cNvGraphicFramePr>
+              <a:graphicFrameLocks noChangeAspect="1"/>
+            </wp:cNvGraphicFramePr>
+            <a:graphic>
+              <a:graphicData uri="http://schemas.openxmlformats.org/drawingml/2006/picture">
+                <pic:pic>
+                  <pic:nvPicPr>
+                    <pic:cNvPr id="0" name="01-驻点工作体系设计_001.png"/>
+                    <pic:cNvPicPr/>
+                  </pic:nvPicPr>
+                  <pic:blipFill>
+                    <a:blip r:embed="rId9"/>
+                    <a:stretch>
+                      <a:fillRect/>
+                    </a:stretch>
+                  </pic:blipFill>
+                  <pic:spPr>
+                    <a:xfrm>
+                      <a:off x="0" y="0"/>
+                      <a:ext cx="5029200" cy="2235200"/>
+                    </a:xfrm>
+                    <a:prstGeom prst="rect"/>
+                  </pic:spPr>
+                </pic:pic>
+              </a:graphicData>
+            </a:graphic>
+          </wp:inline>
+        </w:drawing>
       </w:r>
     </w:p>
     <w:p>
@@ -162,27 +288,80 @@
     <w:p>
       <w:pPr>
         <w:pStyle w:val="Heading4"/>
-        <w:jc w:val="left"/>
+        <w:jc w:val="center"/>
       </w:pPr>
       <w:r>
-        <w:rPr>
-          <w:rFonts w:ascii="Microsoft YaHei" w:hAnsi="Microsoft YaHei" w:eastAsia="Microsoft YaHei"/>
-          <w:b/>
-          <w:sz w:val="22"/>
-        </w:rPr>
-        <w:t>网格服务：服务前置</w:t>
+        <w:drawing>
+          <wp:inline xmlns:a="http://schemas.openxmlformats.org/drawingml/2006/main" xmlns:pic="http://schemas.openxmlformats.org/drawingml/2006/picture">
+            <wp:extent cx="5029200" cy="3241040"/>
+            <wp:docPr id="3" name="Picture 3"/>
+            <wp:cNvGraphicFramePr>
+              <a:graphicFrameLocks noChangeAspect="1"/>
+            </wp:cNvGraphicFramePr>
+            <a:graphic>
+              <a:graphicData uri="http://schemas.openxmlformats.org/drawingml/2006/picture">
+                <pic:pic>
+                  <pic:nvPicPr>
+                    <pic:cNvPr id="0" name="01-驻点工作体系设计_003.png"/>
+                    <pic:cNvPicPr/>
+                  </pic:nvPicPr>
+                  <pic:blipFill>
+                    <a:blip r:embed="rId11"/>
+                    <a:stretch>
+                      <a:fillRect/>
+                    </a:stretch>
+                  </pic:blipFill>
+                  <pic:spPr>
+                    <a:xfrm>
+                      <a:off x="0" y="0"/>
+                      <a:ext cx="5029200" cy="3241040"/>
+                    </a:xfrm>
+                    <a:prstGeom prst="rect"/>
+                  </pic:spPr>
+                </pic:pic>
+              </a:graphicData>
+            </a:graphic>
+          </wp:inline>
+        </w:drawing>
       </w:r>
     </w:p>
     <w:p>
       <w:pPr>
-        <w:jc w:val="both"/>
+        <w:jc w:val="center"/>
       </w:pPr>
       <w:r>
-        <w:rPr>
-          <w:rFonts w:ascii="Microsoft YaHei" w:hAnsi="Microsoft YaHei" w:eastAsia="Microsoft YaHei"/>
-          <w:sz w:val="21"/>
-        </w:rPr>
-        <w:t>核心目标：压降95598工单</w:t>
+        <w:drawing>
+          <wp:inline xmlns:a="http://schemas.openxmlformats.org/drawingml/2006/main" xmlns:pic="http://schemas.openxmlformats.org/drawingml/2006/picture">
+            <wp:extent cx="5029200" cy="4903470"/>
+            <wp:docPr id="7" name="Picture 7"/>
+            <wp:cNvGraphicFramePr>
+              <a:graphicFrameLocks noChangeAspect="1"/>
+            </wp:cNvGraphicFramePr>
+            <a:graphic>
+              <a:graphicData uri="http://schemas.openxmlformats.org/drawingml/2006/picture">
+                <pic:pic>
+                  <pic:nvPicPr>
+                    <pic:cNvPr id="0" name="01-驻点工作体系设计_007.png"/>
+                    <pic:cNvPicPr/>
+                  </pic:nvPicPr>
+                  <pic:blipFill>
+                    <a:blip r:embed="rId13"/>
+                    <a:stretch>
+                      <a:fillRect/>
+                    </a:stretch>
+                  </pic:blipFill>
+                  <pic:spPr>
+                    <a:xfrm>
+                      <a:off x="0" y="0"/>
+                      <a:ext cx="5029200" cy="4903470"/>
+                    </a:xfrm>
+                    <a:prstGeom prst="rect"/>
+                  </pic:spPr>
+                </pic:pic>
+              </a:graphicData>
+            </a:graphic>
+          </wp:inline>
+        </w:drawing>
       </w:r>
     </w:p>
     <w:p>
@@ -224,13 +403,41 @@
     <w:p>
       <w:pPr>
         <w:ind w:left="432"/>
+        <w:jc w:val="center"/>
       </w:pPr>
       <w:r>
-        <w:rPr>
-          <w:rFonts w:ascii="Microsoft YaHei" w:hAnsi="Microsoft YaHei" w:eastAsia="Microsoft YaHei"/>
-          <w:sz w:val="21"/>
-        </w:rPr>
-        <w:t>● 加入小区微信群</w:t>
+        <w:drawing>
+          <wp:inline xmlns:a="http://schemas.openxmlformats.org/drawingml/2006/main" xmlns:pic="http://schemas.openxmlformats.org/drawingml/2006/picture">
+            <wp:extent cx="5029200" cy="3897630"/>
+            <wp:docPr id="9" name="Picture 9"/>
+            <wp:cNvGraphicFramePr>
+              <a:graphicFrameLocks noChangeAspect="1"/>
+            </wp:cNvGraphicFramePr>
+            <a:graphic>
+              <a:graphicData uri="http://schemas.openxmlformats.org/drawingml/2006/picture">
+                <pic:pic>
+                  <pic:nvPicPr>
+                    <pic:cNvPr id="0" name="01-驻点工作体系设计_009.png"/>
+                    <pic:cNvPicPr/>
+                  </pic:nvPicPr>
+                  <pic:blipFill>
+                    <a:blip r:embed="rId15"/>
+                    <a:stretch>
+                      <a:fillRect/>
+                    </a:stretch>
+                  </pic:blipFill>
+                  <pic:spPr>
+                    <a:xfrm>
+                      <a:off x="0" y="0"/>
+                      <a:ext cx="5029200" cy="3897630"/>
+                    </a:xfrm>
+                    <a:prstGeom prst="rect"/>
+                  </pic:spPr>
+                </pic:pic>
+              </a:graphicData>
+            </a:graphic>
+          </wp:inline>
+        </w:drawing>
       </w:r>
     </w:p>
     <w:p>
@@ -382,13 +589,41 @@
     <w:p>
       <w:pPr>
         <w:ind w:left="432"/>
+        <w:jc w:val="center"/>
       </w:pPr>
       <w:r>
-        <w:rPr>
-          <w:rFonts w:ascii="Microsoft YaHei" w:hAnsi="Microsoft YaHei" w:eastAsia="Microsoft YaHei"/>
-          <w:sz w:val="21"/>
-        </w:rPr>
-        <w:t>● 隐患发现和记录</w:t>
+        <w:drawing>
+          <wp:inline xmlns:a="http://schemas.openxmlformats.org/drawingml/2006/main" xmlns:pic="http://schemas.openxmlformats.org/drawingml/2006/picture">
+            <wp:extent cx="5029200" cy="2235200"/>
+            <wp:docPr id="10" name="Picture 10"/>
+            <wp:cNvGraphicFramePr>
+              <a:graphicFrameLocks noChangeAspect="1"/>
+            </wp:cNvGraphicFramePr>
+            <a:graphic>
+              <a:graphicData uri="http://schemas.openxmlformats.org/drawingml/2006/picture">
+                <pic:pic>
+                  <pic:nvPicPr>
+                    <pic:cNvPr id="0" name="01-驻点工作体系设计_002.png"/>
+                    <pic:cNvPicPr/>
+                  </pic:nvPicPr>
+                  <pic:blipFill>
+                    <a:blip r:embed="rId10"/>
+                    <a:stretch>
+                      <a:fillRect/>
+                    </a:stretch>
+                  </pic:blipFill>
+                  <pic:spPr>
+                    <a:xfrm>
+                      <a:off x="0" y="0"/>
+                      <a:ext cx="5029200" cy="2235200"/>
+                    </a:xfrm>
+                    <a:prstGeom prst="rect"/>
+                  </pic:spPr>
+                </pic:pic>
+              </a:graphicData>
+            </a:graphic>
+          </wp:inline>
+        </w:drawing>
       </w:r>
     </w:p>
     <w:p>

</xml_diff>